<commit_message>
Add Linework Control Specification; update Flashover and Switchyard docs
New spec defines the shared rules for all Linework pedals: design rules
for controls, the MIDI loop back to Switchyard, automatic channel
assignment, the shared message map, 128 on-pedal presets and protected
firmware updates.

Flashover: no unlinked version, Soft/Hard push button with two LEDs,
on-pedal presets, firmware updates, and MIDI loop with automatic
channels. Switchyard: adds MIDI in for the loop and matches the spec.

Co-Authored-By: Claude Opus 5.5 <noreply@anthropic.com>
</commit_message>
<xml_diff>
--- a/pedals/controller/Switchyard Product Document.docx
+++ b/pedals/controller/Switchyard Product Document.docx
@@ -200,7 +200,7 @@
               <w:spacing w:before="0" w:after="0"/>
             </w:pPr>
             <w:r>
-              <w:t xml:space="preserve">General Concept.docx; Flashover Product Document.docx</w:t>
+              <w:t xml:space="preserve">General Concept.docx; Linework Control Specification.docx; Flashover Product Document.docx</w:t>
             </w:r>
           </w:p>
         </w:tc>
@@ -553,7 +553,7 @@
               <w:spacing w:before="0" w:after="0"/>
             </w:pPr>
             <w:r>
-              <w:t xml:space="preserve">Sends settings to the Linework pedals. Pedals are daisy-chained: Switchyard to the first pedal’s MIDI in, that pedal’s MIDI thru to the next, and so on</w:t>
+              <w:t xml:space="preserve">Start of the MIDI loop: connects to the first pedal’s MIDI in. Each pedal’s MIDI out connects to the next pedal’s MIDI in</w:t>
             </w:r>
           </w:p>
         </w:tc>
@@ -571,6 +571,37 @@
               <w:spacing w:before="0" w:after="0"/>
             </w:pPr>
             <w:r>
+              <w:t xml:space="preserve">MIDI in (3.5 mm TRS)</w:t>
+            </w:r>
+          </w:p>
+        </w:tc>
+        <w:tc>
+          <w:tcPr>
+            <w:tcW w:w="6560" w:type="dxa"/>
+          </w:tcPr>
+          <w:p>
+            <w:pPr>
+              <w:spacing w:before="0" w:after="0"/>
+            </w:pPr>
+            <w:r>
+              <w:t xml:space="preserve">End of the MIDI loop: the last pedal’s MIDI out connects back here, so Switchyard hears from every pedal</w:t>
+            </w:r>
+          </w:p>
+        </w:tc>
+      </w:tr>
+      <w:tr>
+        <w:trPr>
+          <w:cantSplit/>
+        </w:trPr>
+        <w:tc>
+          <w:tcPr>
+            <w:tcW w:w="2800" w:type="dxa"/>
+          </w:tcPr>
+          <w:p>
+            <w:pPr>
+              <w:spacing w:before="0" w:after="0"/>
+            </w:pPr>
+            <w:r>
               <w:t xml:space="preserve">9V DC power</w:t>
             </w:r>
           </w:p>
@@ -611,6 +642,20 @@
       </w:r>
     </w:p>
     <w:p>
+      <w:r>
+        <w:t xml:space="preserve">The details are defined in the </w:t>
+      </w:r>
+      <w:r>
+        <w:rPr>
+          <w:b/>
+        </w:rPr>
+        <w:t xml:space="preserve">Linework Control Specification</w:t>
+      </w:r>
+      <w:r>
+        <w:t xml:space="preserve">, which every Linework pedal follows. In summary:</w:t>
+      </w:r>
+    </w:p>
+    <w:p>
       <w:pPr>
         <w:pStyle w:val="ListParagraph"/>
         <w:numPr>
@@ -625,7 +670,7 @@
         <w:t xml:space="preserve">To the phone:</w:t>
       </w:r>
       <w:r>
-        <w:t xml:space="preserve"> Switchyard appears to the phone as a standard USB MIDI device. iPhone and Android both support this without drivers or Apple’s MFi licensing program. The app sends setlists and receives footswitch presses over this connection.</w:t>
+        <w:t xml:space="preserve"> Switchyard appears to the phone as a standard USB MIDI device. iPhone and Android both support this without drivers or Apple’s MFi licensing program. The app sends setlists, presets and firmware updates, and receives footswitch presses and the pedals’ current settings over this connection.</w:t>
       </w:r>
     </w:p>
     <w:p>
@@ -640,10 +685,82 @@
         <w:rPr>
           <w:b/>
         </w:rPr>
-        <w:t xml:space="preserve">To the pedals:</w:t>
-      </w:r>
-      <w:r>
-        <w:t xml:space="preserve"> standard MIDI over TRS cables. Each Linework pedal is given its own MIDI channel. On each step, Switchyard sends that pedal’s full set of values (for example gain, tone, level and on/off) as MIDI “control change” messages. The values for Flashover are listed in its product document.</w:t>
+        <w:t xml:space="preserve">To the pedals: a MIDI loop.</w:t>
+      </w:r>
+      <w:r>
+        <w:t xml:space="preserve"> Messages go out from Switchyard, through every pedal in turn, and back to Switchyard. Each pedal passes on what it receives and adds its own messages. One output and one input serve any number of pedals, up to 16.</w:t>
+      </w:r>
+    </w:p>
+    <w:p>
+      <w:pPr>
+        <w:pStyle w:val="ListParagraph"/>
+        <w:numPr>
+          <w:ilvl w:val="0"/>
+          <w:numId w:val="90"/>
+        </w:numPr>
+      </w:pPr>
+      <w:r>
+        <w:rPr>
+          <w:b/>
+        </w:rPr>
+        <w:t xml:space="preserve">Automatic setup:</w:t>
+      </w:r>
+      <w:r>
+        <w:t xml:space="preserve"> Switchyard counts the pedals around the loop, asks each one to identify itself and assigns each a MIDI channel. The app then shows the pedals in the order they’re cabled.</w:t>
+      </w:r>
+    </w:p>
+    <w:p>
+      <w:pPr>
+        <w:pStyle w:val="ListParagraph"/>
+        <w:numPr>
+          <w:ilvl w:val="0"/>
+          <w:numId w:val="90"/>
+        </w:numPr>
+      </w:pPr>
+      <w:r>
+        <w:rPr>
+          <w:b/>
+        </w:rPr>
+        <w:t xml:space="preserve">Stepping through a setlist:</w:t>
+      </w:r>
+      <w:r>
+        <w:t xml:space="preserve"> each pedal stores the settings for each song part as one of its 128 presets, written there by the app. Stepping to the next part sends one short “program change” message per pedal, so even a large board changes in under 10 ms.</w:t>
+      </w:r>
+    </w:p>
+    <w:p>
+      <w:pPr>
+        <w:pStyle w:val="ListParagraph"/>
+        <w:numPr>
+          <w:ilvl w:val="0"/>
+          <w:numId w:val="90"/>
+        </w:numPr>
+      </w:pPr>
+      <w:r>
+        <w:rPr>
+          <w:b/>
+        </w:rPr>
+        <w:t xml:space="preserve">Hand adjustments are reported back.</w:t>
+      </w:r>
+      <w:r>
+        <w:t xml:space="preserve"> If a player turns a knob on a pedal, the pedal tells Switchyard, so the app can show the change and save it to the current part.</w:t>
+      </w:r>
+    </w:p>
+    <w:p>
+      <w:pPr>
+        <w:pStyle w:val="ListParagraph"/>
+        <w:numPr>
+          <w:ilvl w:val="0"/>
+          <w:numId w:val="90"/>
+        </w:numPr>
+      </w:pPr>
+      <w:r>
+        <w:rPr>
+          <w:b/>
+        </w:rPr>
+        <w:t xml:space="preserve">Firmware updates:</w:t>
+      </w:r>
+      <w:r>
+        <w:t xml:space="preserve"> the app downloads updates and sends them through Switchyard to each pedal over the loop. Switchyard itself is updated directly over USB.</w:t>
       </w:r>
     </w:p>
     <w:p>
@@ -848,7 +965,7 @@
               <w:spacing w:before="0" w:after="0"/>
             </w:pPr>
             <w:r>
-              <w:t xml:space="preserve">MIDI out circuit and TRS jack</w:t>
+              <w:t xml:space="preserve">MIDI out and in circuits, two TRS jacks</w:t>
             </w:r>
           </w:p>
         </w:tc>
@@ -861,7 +978,7 @@
               <w:spacing w:before="0" w:after="0"/>
             </w:pPr>
             <w:r>
-              <w:t xml:space="preserve">A few resistors and a 3.5 mm jack</w:t>
+              <w:t xml:space="preserve">A few resistors, an optocoupler for the input, and two 3.5 mm jacks</w:t>
             </w:r>
           </w:p>
         </w:tc>
@@ -874,7 +991,7 @@
               <w:spacing w:before="0" w:after="0"/>
             </w:pPr>
             <w:r>
-              <w:t xml:space="preserve">$1–2</w:t>
+              <w:t xml:space="preserve">$2–4</w:t>
             </w:r>
           </w:p>
         </w:tc>
@@ -1138,7 +1255,7 @@
               <w:rPr>
                 <w:b/>
               </w:rPr>
-              <w:t xml:space="preserve">about $25–50</w:t>
+              <w:t xml:space="preserve">about $26–52</w:t>
             </w:r>
           </w:p>
         </w:tc>
@@ -1242,7 +1359,31 @@
         </w:numPr>
       </w:pPr>
       <w:r>
-        <w:t xml:space="preserve">Send the setlist to Switchyard and confirm it saved.</w:t>
+        <w:t xml:space="preserve">Send the setlist to Switchyard and the matching presets to each pedal, and confirm they saved.</w:t>
+      </w:r>
+    </w:p>
+    <w:p>
+      <w:pPr>
+        <w:pStyle w:val="ListParagraph"/>
+        <w:numPr>
+          <w:ilvl w:val="0"/>
+          <w:numId w:val="90"/>
+        </w:numPr>
+      </w:pPr>
+      <w:r>
+        <w:t xml:space="preserve">Show the connected pedals in board order, and save a pedal’s hand-adjusted settings to the current part.</w:t>
+      </w:r>
+    </w:p>
+    <w:p>
+      <w:pPr>
+        <w:pStyle w:val="ListParagraph"/>
+        <w:numPr>
+          <w:ilvl w:val="0"/>
+          <w:numId w:val="90"/>
+        </w:numPr>
+      </w:pPr>
+      <w:r>
+        <w:t xml:space="preserve">Download and install firmware updates for Switchyard and the pedals.</w:t>
       </w:r>
     </w:p>
     <w:p>
@@ -1334,7 +1475,7 @@
         </w:numPr>
       </w:pPr>
       <w:r>
-        <w:t xml:space="preserve">One MIDI out with daisy-chaining, or several outputs?</w:t>
+        <w:t xml:space="preserve">Should Switchyard offer a second MIDI loop for very large boards?</w:t>
       </w:r>
     </w:p>
     <w:p>

</xml_diff>

<commit_message>
Add a MIDI out for other brands' pedals to Switchyard
A third 3.5 mm TRS jack, outside the Linework loop, sends program
changes to MIDI pedals from other brands. Updates connections, the
hardware outline and costs, app features and the decisions list.

Co-Authored-By: Claude Opus 5.5 <noreply@anthropic.com>
</commit_message>
<xml_diff>
--- a/pedals/controller/Switchyard Product Document.docx
+++ b/pedals/controller/Switchyard Product Document.docx
@@ -626,6 +626,37 @@
               <w:spacing w:before="0" w:after="0"/>
             </w:pPr>
             <w:r>
+              <w:t xml:space="preserve">MIDI out for other brands (3.5 mm TRS)</w:t>
+            </w:r>
+          </w:p>
+        </w:tc>
+        <w:tc>
+          <w:tcPr>
+            <w:tcW w:w="6560" w:type="dxa"/>
+          </w:tcPr>
+          <w:p>
+            <w:pPr>
+              <w:spacing w:before="0" w:after="0"/>
+            </w:pPr>
+            <w:r>
+              <w:t xml:space="preserve">Out only, outside the loop. Sends program changes to MIDI pedals from other brands, which usually don’t pass messages around a loop. Several can be chained through their own MIDI thru jacks or a MIDI splitter</w:t>
+            </w:r>
+          </w:p>
+        </w:tc>
+      </w:tr>
+      <w:tr>
+        <w:trPr>
+          <w:cantSplit/>
+        </w:trPr>
+        <w:tc>
+          <w:tcPr>
+            <w:tcW w:w="2800" w:type="dxa"/>
+          </w:tcPr>
+          <w:p>
+            <w:pPr>
+              <w:spacing w:before="0" w:after="0"/>
+            </w:pPr>
+            <w:r>
               <w:t xml:space="preserve">9V DC power</w:t>
             </w:r>
           </w:p>
@@ -894,7 +925,13 @@
         </w:numPr>
       </w:pPr>
       <w:r>
-        <w:t xml:space="preserve">Because it uses standard MIDI, Switchyard could also control MIDI pedals from other brands. That’s a possible selling point to look at later.</w:t>
+        <w:rPr>
+          <w:b/>
+        </w:rPr>
+        <w:t xml:space="preserve">Other brands’ pedals:</w:t>
+      </w:r>
+      <w:r>
+        <w:t xml:space="preserve"> a third MIDI jack, outside the loop, sends program changes to MIDI pedals from other brands (for example Strymon, Boss, Eventide, Chase Bliss and Meris pedals). The player saves sounds on those pedals as usual, sets each one’s MIDI channel on the pedal, and adds it in the app by hand. The app then picks a preset number for each song part, and Switchyard sends it in the same step as the Linework pedals. These pedals can’t be found automatically, report knob changes or receive presets and firmware from the app. Many use 5-pin DIN or ¼″ TRS connectors, so players use adapter cables; Switchyard uses the standard Type A wiring.</w:t>
       </w:r>
     </w:p>
     <w:p>
@@ -1087,7 +1124,7 @@
               <w:spacing w:before="0" w:after="0"/>
             </w:pPr>
             <w:r>
-              <w:t xml:space="preserve">MIDI out and in circuits, two TRS jacks</w:t>
+              <w:t xml:space="preserve">MIDI circuits: loop out and in, plus an out for other brands, three TRS jacks</w:t>
             </w:r>
           </w:p>
         </w:tc>
@@ -1100,7 +1137,7 @@
               <w:spacing w:before="0" w:after="0"/>
             </w:pPr>
             <w:r>
-              <w:t xml:space="preserve">A few resistors, an H11L1 optocoupler for the input (as on Flashover), and two 3.5 mm jacks</w:t>
+              <w:t xml:space="preserve">A few resistors, an H11L1 optocoupler for the input (as on Flashover), and three 3.5 mm jacks</w:t>
             </w:r>
           </w:p>
         </w:tc>
@@ -1113,7 +1150,7 @@
               <w:spacing w:before="0" w:after="0"/>
             </w:pPr>
             <w:r>
-              <w:t xml:space="preserve">$2–4</w:t>
+              <w:t xml:space="preserve">$3–6</w:t>
             </w:r>
           </w:p>
         </w:tc>
@@ -1421,7 +1458,7 @@
               <w:rPr>
                 <w:b/>
               </w:rPr>
-              <w:t xml:space="preserve">about $28–56</w:t>
+              <w:t xml:space="preserve">about $29–58</w:t>
             </w:r>
           </w:p>
         </w:tc>
@@ -1550,6 +1587,18 @@
       </w:pPr>
       <w:r>
         <w:t xml:space="preserve">Download and install firmware updates for Switchyard and the pedals.</w:t>
+      </w:r>
+    </w:p>
+    <w:p>
+      <w:pPr>
+        <w:pStyle w:val="ListParagraph"/>
+        <w:numPr>
+          <w:ilvl w:val="0"/>
+          <w:numId w:val="90"/>
+        </w:numPr>
+      </w:pPr>
+      <w:r>
+        <w:t xml:space="preserve">Add pedals from other brands by hand (name and MIDI channel) and choose their preset number for each song part.</w:t>
       </w:r>
     </w:p>
     <w:p>
@@ -1760,6 +1809,24 @@
     </w:p>
     <w:p>
       <w:pPr>
+        <w:pStyle w:val="ListParagraph"/>
+        <w:numPr>
+          <w:ilvl w:val="0"/>
+          <w:numId w:val="90"/>
+        </w:numPr>
+      </w:pPr>
+      <w:r>
+        <w:rPr>
+          <w:b/>
+        </w:rPr>
+        <w:t xml:space="preserve">MIDI out for other brands:</w:t>
+      </w:r>
+      <w:r>
+        <w:t xml:space="preserve"> included as a third MIDI jack, outside the loop. Program changes work with almost any MIDI pedal, so Switchyard is useful to players who don’t own many Linework pedals yet. Per-brand knob control (control change maps) may come later.</w:t>
+      </w:r>
+    </w:p>
+    <w:p>
+      <w:pPr>
         <w:pStyle w:val="Heading1"/>
       </w:pPr>
       <w:r>
@@ -1776,18 +1843,6 @@
       </w:pPr>
       <w:r>
         <w:t xml:space="preserve">How should the phone be mounted: a built-in cradle, a clip, or just a short cable?</w:t>
-      </w:r>
-    </w:p>
-    <w:p>
-      <w:pPr>
-        <w:pStyle w:val="ListParagraph"/>
-        <w:numPr>
-          <w:ilvl w:val="0"/>
-          <w:numId w:val="90"/>
-        </w:numPr>
-      </w:pPr>
-      <w:r>
-        <w:t xml:space="preserve">Should there be a separate MIDI out jack (no input) for other brands’ MIDI pedals, which usually don’t pass messages around a loop? About $1–2.</w:t>
       </w:r>
     </w:p>
     <w:p>

</xml_diff>